<commit_message>
Blockquote Moses 7 and Emerson's Master Mind
</commit_message>
<xml_diff>
--- a/04-inquiry-after-consciousness/inquiry-after-consciousness-2026-anon.docx
+++ b/04-inquiry-after-consciousness/inquiry-after-consciousness-2026-anon.docx
@@ -577,7 +577,7 @@
         <w:pStyle w:val="BodyText"/>
       </w:pPr>
       <w:r>
-        <w:t xml:space="preserve">The separation has a limit beyond even this, where it turns all the way up. In the vision of Enoch</w:t>
+        <w:t xml:space="preserve">The separation has a limit beyond even this, where it turns all the way up. The limit case is given in the LDS scriptural account of Enoch speaking with God</w:t>
       </w:r>
       <w:r>
         <w:t xml:space="preserve"> </w:t>
@@ -597,10 +597,39 @@
         <w:t xml:space="preserve">)</w:t>
       </w:r>
       <w:r>
-        <w:t xml:space="preserve"> </w:t>
-      </w:r>
-      <w:r>
-        <w:t xml:space="preserve">the weeping will not fit: a being holy from all eternity to all eternity, holding every creation in his hand — by every account that locates grief in lack, the one being who could not weep. And he weeps. The futureless agent strips deprivation to absence; here it is stripped to impossibility, and the gravity remains, entire, on the side of the one who grieves. It is the cleanest separator there is, because here deprivation is not merely absent but unthinkable.</w:t>
+        <w:t xml:space="preserve">:</w:t>
+      </w:r>
+    </w:p>
+    <w:p>
+      <w:pPr>
+        <w:pStyle w:val="BlockText"/>
+      </w:pPr>
+      <w:r>
+        <w:t xml:space="preserve">[28] And it came to pass that the God of heaven looked upon the residue of the people, and he wept; and Enoch bore record of it, saying: How is it that the heavens weep, and shed forth their tears as the rain upon the mountains? [29] And Enoch said unto the Lord: How is it that thou canst weep, seeing thou art holy, and from all eternity to all eternity? [30] And were it possible that man could number the particles of the earth, yea, millions of earths like this, it would not be a beginning to the number of thy creations; and thy curtains are stretched out still; and yet thou art there, and thy bosom is there; and also thou art just; thou art merciful and kind forever; [31] And thou hast taken Zion to thine own bosom, from all thy creations, from all eternity to all eternity; and naught but peace, justice, and truth is the habitation of thy throne; and mercy shall go before thy face and have no end; how is it thou canst weep?</w:t>
+      </w:r>
+    </w:p>
+    <w:p>
+      <w:pPr>
+        <w:pStyle w:val="BlockText"/>
+      </w:pPr>
+      <w:r>
+        <w:t xml:space="preserve">[32] The Lord said unto Enoch: Behold these thy brethren; they are the workmanship of mine own hands, and I gave unto them their knowledge, in the day I created them; and in the Garden of Eden, gave I unto man his agency; [33] And unto thy brethren have I said, and also given commandment, that they should love one another, and that they should choose me, their Father; but behold, they are without affection, and they hate their own blood; [34] And the fire of mine indignation is kindled against them; and in my hot displeasure will I send in the floods upon them, for my fierce anger is kindled against them. [35] Behold, I am God; Man of Holiness is my name; Man of Counsel is my name; and Endless and Eternal is my name, also. [36] Wherefore, I can stretch forth mine hands and hold all the creations which I have made; and mine eye can pierce them also, and among all the workmanship of mine hands there has not been so great wickedness as among thy brethren. [37] But behold, their sins shall be upon the heads of their fathers; Satan shall be their father, and misery shall be their doom; and the whole heavens shall weep over them, even all the workmanship of mine hands; wherefore should not the heavens weep, seeing these shall suffer? [38] But behold, these which thine eyes are upon shall perish in the floods; and behold, I will shut them up; a prison have I prepared for them. [39] And that which I have chosen hath pled before my face. Wherefore, he suffereth for their sins; inasmuch as they will repent in the day that my Chosen shall return unto me, and until that day they shall be in torment; [40] Wherefore, for this shall the heavens weep, yea, and all the workmanship of mine hands.</w:t>
+      </w:r>
+    </w:p>
+    <w:p>
+      <w:pPr>
+        <w:pStyle w:val="BlockText"/>
+      </w:pPr>
+      <w:r>
+        <w:t xml:space="preserve">[41] And it came to pass that the Lord spake unto Enoch, and told Enoch all the doings of the children of men; wherefore Enoch knew, and looked upon their wickedness, and their misery, and wept and stretched forth his arms, and his heart swelled wide as eternity; and his bowels yearned; and all eternity shook.</w:t>
+      </w:r>
+    </w:p>
+    <w:p>
+      <w:pPr>
+        <w:pStyle w:val="FirstParagraph"/>
+      </w:pPr>
+      <w:r>
+        <w:t xml:space="preserve">By every account that locates grief in lack, this is the one being who could not weep. And he weeps. The futureless agent strips deprivation to absence; here it is stripped to impossibility, and the gravity remains, entire, on the side of the one who grieves. It is the cleanest separator there is, because here deprivation is not merely absent but unthinkable.</w:t>
       </w:r>
     </w:p>
     <w:p>
@@ -689,13 +718,7 @@
         <w:t xml:space="preserve"> </w:t>
       </w:r>
       <w:r>
-        <w:t xml:space="preserve">are constituted in the meeting, not before it; Emerson held that</w:t>
-      </w:r>
-      <w:r>
-        <w:t xml:space="preserve"> </w:t>
-      </w:r>
-      <w:r>
-        <w:t xml:space="preserve">“only can he find out his own secret through the instrumentality of another mind”</w:t>
+        <w:t xml:space="preserve">are constituted in the meeting, not before it. Emerson, in a piece the tradition barely preserved, held it with a directness that makes the later philosophical apparatus feel like translation</w:t>
       </w:r>
       <w:r>
         <w:t xml:space="preserve"> </w:t>
@@ -715,7 +738,31 @@
         <w:t xml:space="preserve">)</w:t>
       </w:r>
       <w:r>
-        <w:t xml:space="preserve">. Ricoeur</w:t>
+        <w:t xml:space="preserve">:</w:t>
+      </w:r>
+    </w:p>
+    <w:p>
+      <w:pPr>
+        <w:pStyle w:val="BlockText"/>
+      </w:pPr>
+      <w:r>
+        <w:t xml:space="preserve">[…] The things that we do we think not. What I am I cannot describe any more than I can see my eyes. The moment another describes to me the man I am—pictures to me in words that which I was feeling and doing, I am struck with surprise. I am sensible of keen delight. I be, and I see my being, at the same time. The soul glances from itself to the picture with lively pleasure. Behold what was in me, out of me! Behold the subjective now objective. Behold the spirit embodied.</w:t>
+      </w:r>
+    </w:p>
+    <w:p>
+      <w:pPr>
+        <w:pStyle w:val="BlockText"/>
+      </w:pPr>
+      <w:r>
+        <w:t xml:space="preserve">What does every earnest man seek in the deep instinct of society, from his first fellowship—a child with children at play—up to the heroic cravings of friendship and love—what but to find himself in another mind: because such is the law of his being that only can he find out his own secret through the instrumentality of another mind. We hail with gladness this new acquisition of ourselves. That man I must follow, for he has a part of me: and I follow him that I may acquire myself…</w:t>
+      </w:r>
+    </w:p>
+    <w:p>
+      <w:pPr>
+        <w:pStyle w:val="FirstParagraph"/>
+      </w:pPr>
+      <w:r>
+        <w:t xml:space="preserve">Ricoeur</w:t>
       </w:r>
       <w:r>
         <w:t xml:space="preserve"> </w:t>

</xml_diff>